<commit_message>
docs: correct text encoding issues, add student card header, and update report formatting in docx
</commit_message>
<xml_diff>
--- a/Laboratorio 3 — Matrix build enterprise.docx
+++ b/Laboratorio 3 — Matrix build enterprise.docx
@@ -1,5 +1,14 @@
 
 <file path=customXml\item1.xml><?xml version="1.0" encoding="utf-8"?>
+<?mso-contentType ?>
+<FormTemplates xmlns="http://schemas.microsoft.com/sharepoint/v3/contenttype/forms">
+  <Display>DocumentLibraryForm</Display>
+  <Edit>DocumentLibraryForm</Edit>
+  <New>DocumentLibraryForm</New>
+</FormTemplates>
+</file>
+
+<file path=customXml\item2.xml><?xml version="1.0" encoding="utf-8"?>
 <ct:contentTypeSchema xmlns:ct="http://schemas.microsoft.com/office/2006/metadata/contentType" xmlns:ma="http://schemas.microsoft.com/office/2006/metadata/properties/metaAttributes" ct:_="" ma:_="" ma:contentTypeName="Documento" ma:contentTypeID="0x010100BD25F2543A93FF49B5E136C5177DD71B" ma:contentTypeVersion="11" ma:contentTypeDescription="Crear nuevo documento." ma:contentTypeScope="" ma:versionID="d30111ca94961c0149d00d4cfe1d43eb">
   <xsd:schema xmlns:xsd="http://www.w3.org/2001/XMLSchema" xmlns:xs="http://www.w3.org/2001/XMLSchema" xmlns:p="http://schemas.microsoft.com/office/2006/metadata/properties" xmlns:ns2="74566d1c-f28c-4236-87a6-c4275ce20146" xmlns:ns3="8b90cb47-533b-4348-8377-2555f410ee9a" targetNamespace="http://schemas.microsoft.com/office/2006/metadata/properties" ma:root="true" ma:fieldsID="bb8df4d46631e7b5bd3a4bc628669a6c" ns2:_="" ns3:_="">
     <xsd:import namespace="74566d1c-f28c-4236-87a6-c4275ce20146"/>
@@ -194,15 +203,6 @@
 </ct:contentTypeSchema>
 </file>
 
-<file path=customXml\item2.xml><?xml version="1.0" encoding="utf-8"?>
-<?mso-contentType ?>
-<FormTemplates xmlns="http://schemas.microsoft.com/sharepoint/v3/contenttype/forms">
-  <Display>DocumentLibraryForm</Display>
-  <Edit>DocumentLibraryForm</Edit>
-  <New>DocumentLibraryForm</New>
-</FormTemplates>
-</file>
-
 <file path=customXml\item3.xml><?xml version="1.0" encoding="utf-8"?>
 <p:properties xmlns:p="http://schemas.microsoft.com/office/2006/metadata/properties" xmlns:xsi="http://www.w3.org/2001/XMLSchema-instance" xmlns:pc="http://schemas.microsoft.com/office/infopath/2007/PartnerControls">
   <documentManagement>
@@ -216,32 +216,58 @@
 </file>
 
 <file path=customXml\itemProps1.xml><?xml version="1.0" encoding="utf-8"?>
-<ds:datastoreItem xmlns:ds="http://schemas.openxmlformats.org/officeDocument/2006/customXml" ds:itemID="{95BA70D5-D2CB-4F7B-BFC6-36220B6B5643}"/>
+<ds:datastoreItem xmlns:ds="http://schemas.openxmlformats.org/officeDocument/2006/customXml" ds:itemID="{7B0266B4-5950-42FB-AAB5-3F8C95D36BDF}">
+  <ds:schemaRefs>
+    <ds:schemaRef ds:uri="http://schemas.microsoft.com/sharepoint/v3/contenttype/forms"/>
+  </ds:schemaRefs>
+</ds:datastoreItem>
 </file>
 
 <file path=customXml\itemProps2.xml><?xml version="1.0" encoding="utf-8"?>
-<ds:datastoreItem xmlns:ds="http://schemas.openxmlformats.org/officeDocument/2006/customXml" ds:itemID="{7B0266B4-5950-42FB-AAB5-3F8C95D36BDF}"/>
+<ds:datastoreItem xmlns:ds="http://schemas.openxmlformats.org/officeDocument/2006/customXml" ds:itemID="{95BA70D5-D2CB-4F7B-BFC6-36220B6B5643}">
+  <ds:schemaRefs>
+    <ds:schemaRef ds:uri="http://schemas.microsoft.com/office/2006/metadata/contentType"/>
+    <ds:schemaRef ds:uri="http://schemas.microsoft.com/office/2006/metadata/properties/metaAttributes"/>
+    <ds:schemaRef ds:uri="http://www.w3.org/2001/XMLSchema"/>
+    <ds:schemaRef ds:uri="http://schemas.microsoft.com/office/2006/metadata/properties"/>
+    <ds:schemaRef ds:uri="74566d1c-f28c-4236-87a6-c4275ce20146"/>
+    <ds:schemaRef ds:uri="8b90cb47-533b-4348-8377-2555f410ee9a"/>
+    <ds:schemaRef ds:uri="http://schemas.microsoft.com/office/2006/documentManagement/types"/>
+    <ds:schemaRef ds:uri="http://schemas.microsoft.com/office/infopath/2007/PartnerControls"/>
+    <ds:schemaRef ds:uri="http://schemas.openxmlformats.org/package/2006/metadata/core-properties"/>
+    <ds:schemaRef ds:uri="http://purl.org/dc/elements/1.1/"/>
+    <ds:schemaRef ds:uri="http://purl.org/dc/terms/"/>
+    <ds:schemaRef ds:uri="http://schemas.microsoft.com/internal/obd"/>
+  </ds:schemaRefs>
+</ds:datastoreItem>
 </file>
 
 <file path=customXml\itemProps3.xml><?xml version="1.0" encoding="utf-8"?>
-<ds:datastoreItem xmlns:ds="http://schemas.openxmlformats.org/officeDocument/2006/customXml" ds:itemID="{65BEC5A1-5CF9-4A1A-9A27-2C0571A4E079}"/>
+<ds:datastoreItem xmlns:ds="http://schemas.openxmlformats.org/officeDocument/2006/customXml" ds:itemID="{65BEC5A1-5CF9-4A1A-9A27-2C0571A4E079}">
+  <ds:schemaRefs>
+    <ds:schemaRef ds:uri="http://schemas.microsoft.com/office/2006/metadata/properties"/>
+    <ds:schemaRef ds:uri="http://schemas.microsoft.com/office/infopath/2007/PartnerControls"/>
+    <ds:schemaRef ds:uri="74566d1c-f28c-4236-87a6-c4275ce20146"/>
+    <ds:schemaRef ds:uri="8b90cb47-533b-4348-8377-2555f410ee9a"/>
+  </ds:schemaRefs>
+</ds:datastoreItem>
 </file>
 
 <file path=docProps\app.xml><?xml version="1.0" encoding="utf-8"?>
 <Properties xmlns="http://schemas.openxmlformats.org/officeDocument/2006/extended-properties" xmlns:vt="http://schemas.openxmlformats.org/officeDocument/2006/docPropsVTypes">
-  <Template>Normal.dotm</Template>
-  <TotalTime>1</TotalTime>
-  <Pages>3</Pages>
-  <Words>193</Words>
-  <Characters>1065</Characters>
+  <Template>Normal</Template>
+  <TotalTime>8</TotalTime>
+  <Pages>6</Pages>
+  <Words>760</Words>
+  <Characters>4185</Characters>
   <Application>Microsoft Office Word</Application>
   <DocSecurity>0</DocSecurity>
-  <Lines>8</Lines>
-  <Paragraphs>2</Paragraphs>
+  <Lines>34</Lines>
+  <Paragraphs>9</Paragraphs>
   <ScaleCrop>false</ScaleCrop>
   <Company/>
   <LinksUpToDate>false</LinksUpToDate>
-  <CharactersWithSpaces>1256</CharactersWithSpaces>
+  <CharactersWithSpaces>4936</CharactersWithSpaces>
   <SharedDoc>false</SharedDoc>
   <HyperlinksChanged>false</HyperlinksChanged>
   <AppVersion>16.0000</AppVersion>
@@ -255,10 +281,10 @@
   <dc:creator>Carlos Serra Martinez</dc:creator>
   <cp:keywords/>
   <dc:description/>
-  <cp:lastModifiedBy>Carlos Serra Martinez</cp:lastModifiedBy>
-  <cp:revision>2</cp:revision>
+  <cp:lastModifiedBy>Lucas Arranz del Río</cp:lastModifiedBy>
+  <cp:revision>3</cp:revision>
   <dcterms:created xsi:type="dcterms:W3CDTF">2026-05-18T11:40:00Z</dcterms:created>
-  <dcterms:modified xsi:type="dcterms:W3CDTF">2026-05-18T11:41:00Z</dcterms:modified>
+  <dcterms:modified xsi:type="dcterms:W3CDTF">2026-05-20T08:34:00Z</dcterms:modified>
 </cp:coreProperties>
 </file>
 
@@ -275,6 +301,83 @@
   <w:body>
     <w:p>
       <w:pPr>
+        <w:spacing w:before="120" w:after="120" w:line="240" w:lineRule="auto"/>
+      </w:pPr>
+      <w:r>
+        <w:rPr>
+          <w:rFonts w:ascii="Calibri" w:hAnsi="Calibri"/>
+          <w:b/>
+          <w:color w:val="1F4E78"/>
+        </w:rPr>
+        <w:t>----------------------------------------------------------------------</w:t>
+      </w:r>
+    </w:p>
+    <w:p>
+      <w:pPr>
+        <w:spacing w:before="120" w:after="120" w:line="240" w:lineRule="auto"/>
+      </w:pPr>
+      <w:r>
+        <w:rPr>
+          <w:rFonts w:ascii="Calibri" w:hAnsi="Calibri"/>
+          <w:b/>
+          <w:color w:val="1F4E78"/>
+        </w:rPr>
+        <w:t>ESTUDIANTE: Lucas Arranz del Río</w:t>
+      </w:r>
+    </w:p>
+    <w:p>
+      <w:pPr>
+        <w:spacing w:before="120" w:after="120" w:line="240" w:lineRule="auto"/>
+      </w:pPr>
+      <w:r>
+        <w:rPr>
+          <w:rFonts w:ascii="Calibri" w:hAnsi="Calibri"/>
+          <w:b/>
+          <w:color w:val="1F4E78"/>
+        </w:rPr>
+        <w:t>LABORATORIO: Laboratorio 3 - Matrix Build Enterprise</w:t>
+      </w:r>
+    </w:p>
+    <w:p>
+      <w:pPr>
+        <w:spacing w:before="120" w:after="120" w:line="240" w:lineRule="auto"/>
+      </w:pPr>
+      <w:r>
+        <w:rPr>
+          <w:rFonts w:ascii="Calibri" w:hAnsi="Calibri"/>
+          <w:b/>
+          <w:color w:val="1F4E78"/>
+        </w:rPr>
+        <w:t>FECHA: 20/05/2026</w:t>
+      </w:r>
+    </w:p>
+    <w:p>
+      <w:pPr>
+        <w:spacing w:before="120" w:after="120" w:line="240" w:lineRule="auto"/>
+      </w:pPr>
+      <w:r>
+        <w:rPr>
+          <w:rFonts w:ascii="Calibri" w:hAnsi="Calibri"/>
+          <w:b/>
+          <w:color w:val="1F4E78"/>
+        </w:rPr>
+        <w:t>----------------------------------------------------------------------</w:t>
+      </w:r>
+    </w:p>
+    <w:p>
+      <w:pPr>
+        <w:spacing w:before="120" w:after="120" w:line="240" w:lineRule="auto"/>
+      </w:pPr>
+      <w:r>
+        <w:rPr>
+          <w:rFonts w:ascii="Calibri" w:hAnsi="Calibri"/>
+        </w:rPr>
+        <w:t>
+        </w:t>
+      </w:r>
+    </w:p>
+    <w:p>
+      <w:pPr>
         <w:rPr>
           <w:b/>
           <w:bCs/>
@@ -285,33 +388,8 @@
           <w:b/>
           <w:bCs/>
         </w:rPr>
-        <w:t xml:space="preserve">Laboratorio 3 â€” Matrix </w:t>
-      </w:r>
-      <w:proofErr w:type="spellStart"/>
-      <w:r>
-        <w:rPr>
-          <w:b/>
-          <w:bCs/>
-        </w:rPr>
-        <w:t>build</w:t>
-      </w:r>
-      <w:proofErr w:type="spellEnd"/>
-      <w:r>
-        <w:rPr>
-          <w:b/>
-          <w:bCs/>
-        </w:rPr>
-        <w:t xml:space="preserve"> </w:t>
-      </w:r>
-      <w:proofErr w:type="spellStart"/>
-      <w:r>
-        <w:rPr>
-          <w:b/>
-          <w:bCs/>
-        </w:rPr>
-        <w:t>enterprise</w:t>
-      </w:r>
-      <w:proofErr w:type="spellEnd"/>
+        <w:t>Laboratorio 3 â€” Matrix build enterprise</w:t>
+      </w:r>
     </w:p>
     <w:p>
       <w:pPr>
@@ -360,11 +438,9 @@
           <w:numId w:val="1"/>
         </w:numPr>
       </w:pPr>
-      <w:proofErr w:type="spellStart"/>
       <w:r>
         <w:t>strategy</w:t>
       </w:r>
-      <w:proofErr w:type="spellEnd"/>
     </w:p>
     <w:p>
       <w:pPr>
@@ -373,11 +449,9 @@
           <w:numId w:val="1"/>
         </w:numPr>
       </w:pPr>
-      <w:proofErr w:type="spellStart"/>
       <w:r>
         <w:t>matrix</w:t>
       </w:r>
-      <w:proofErr w:type="spellEnd"/>
     </w:p>
     <w:p>
       <w:pPr>
@@ -386,19 +460,9 @@
           <w:numId w:val="1"/>
         </w:numPr>
       </w:pPr>
-      <w:proofErr w:type="spellStart"/>
-      <w:r>
-        <w:t>include</w:t>
-      </w:r>
-      <w:proofErr w:type="spellEnd"/>
-      <w:r>
-        <w:t>/</w:t>
-      </w:r>
-      <w:proofErr w:type="spellStart"/>
-      <w:r>
-        <w:t>exclude</w:t>
-      </w:r>
-      <w:proofErr w:type="spellEnd"/>
+      <w:r>
+        <w:t>include/exclude</w:t>
+      </w:r>
     </w:p>
     <w:p>
       <w:pPr>
@@ -407,11 +471,9 @@
           <w:numId w:val="1"/>
         </w:numPr>
       </w:pPr>
-      <w:proofErr w:type="spellStart"/>
       <w:r>
         <w:t>fail-fast</w:t>
       </w:r>
-      <w:proofErr w:type="spellEnd"/>
     </w:p>
     <w:p>
       <w:pPr>
@@ -420,11 +482,9 @@
           <w:numId w:val="1"/>
         </w:numPr>
       </w:pPr>
-      <w:proofErr w:type="spellStart"/>
       <w:r>
         <w:t>concurrency</w:t>
       </w:r>
-      <w:proofErr w:type="spellEnd"/>
     </w:p>
     <w:p>
       <w:pPr>
@@ -433,24 +493,14 @@
           <w:numId w:val="1"/>
         </w:numPr>
       </w:pPr>
-      <w:proofErr w:type="spellStart"/>
-      <w:r>
-        <w:t>job</w:t>
-      </w:r>
-      <w:proofErr w:type="spellEnd"/>
-      <w:r>
-        <w:t xml:space="preserve"> </w:t>
-      </w:r>
-      <w:proofErr w:type="spellStart"/>
-      <w:r>
-        <w:t>summaries</w:t>
-      </w:r>
-      <w:proofErr w:type="spellEnd"/>
-    </w:p>
-    <w:p>
-      <w:r>
-        <w:pict w14:anchorId="411DFD71">
-          <v:rect id="_x0000_i1079" style="width:0;height:1.5pt" o:hralign="center" o:hrstd="t" o:hr="t" fillcolor="#a0a0a0" stroked="f"/>
+      <w:r>
+        <w:t>job summaries</w:t>
+      </w:r>
+    </w:p>
+    <w:p>
+      <w:r>
+        <w:pict w14:anchorId="1F69A80B">
+          <v:rect id="_x0000_i1025" style="width:0;height:1.5pt" o:hralign="center" o:hrstd="t" o:hr="t" fillcolor="#a0a0a0" stroked="f"/>
         </w:pict>
       </w:r>
     </w:p>
@@ -509,13 +559,8 @@
         </w:numPr>
       </w:pPr>
       <w:r>
-        <w:t xml:space="preserve">Dos versiones </w:t>
-      </w:r>
-      <w:proofErr w:type="spellStart"/>
-      <w:r>
-        <w:t>Node</w:t>
-      </w:r>
-      <w:proofErr w:type="spellEnd"/>
+        <w:t>Dos versiones Node</w:t>
+      </w:r>
     </w:p>
     <w:p>
       <w:pPr>
@@ -530,8 +575,8 @@
     </w:p>
     <w:p>
       <w:r>
-        <w:pict w14:anchorId="3690B317">
-          <v:rect id="_x0000_i1080" style="width:0;height:1.5pt" o:hralign="center" o:hrstd="t" o:hr="t" fillcolor="#a0a0a0" stroked="f"/>
+        <w:pict w14:anchorId="3360800B">
+          <v:rect id="_x0000_i1026" style="width:0;height:1.5pt" o:hralign="center" o:hrstd="t" o:hr="t" fillcolor="#a0a0a0" stroked="f"/>
         </w:pict>
       </w:r>
     </w:p>
@@ -567,15 +612,7 @@
     </w:p>
     <w:p>
       <w:r>
-        <w:t xml:space="preserve">Construir una </w:t>
-      </w:r>
-      <w:proofErr w:type="spellStart"/>
-      <w:r>
-        <w:t>matrix</w:t>
-      </w:r>
-      <w:proofErr w:type="spellEnd"/>
-      <w:r>
-        <w:t xml:space="preserve"> que combine:</w:t>
+        <w:t>Construir una matrix que combine:</w:t>
       </w:r>
     </w:p>
     <w:p>
@@ -597,13 +634,8 @@
         </w:numPr>
       </w:pPr>
       <w:r>
-        <w:t xml:space="preserve">Versiones </w:t>
-      </w:r>
-      <w:proofErr w:type="spellStart"/>
-      <w:r>
-        <w:t>runtime</w:t>
-      </w:r>
-      <w:proofErr w:type="spellEnd"/>
+        <w:t>Versiones runtime</w:t>
+      </w:r>
     </w:p>
     <w:p>
       <w:pPr>
@@ -613,26 +645,13 @@
         </w:numPr>
       </w:pPr>
       <w:r>
-        <w:t xml:space="preserve">Modo </w:t>
-      </w:r>
-      <w:proofErr w:type="spellStart"/>
-      <w:r>
-        <w:t>debug</w:t>
-      </w:r>
-      <w:proofErr w:type="spellEnd"/>
-      <w:r>
-        <w:t>/</w:t>
-      </w:r>
-      <w:proofErr w:type="spellStart"/>
-      <w:r>
-        <w:t>release</w:t>
-      </w:r>
-      <w:proofErr w:type="spellEnd"/>
-    </w:p>
-    <w:p>
-      <w:r>
-        <w:pict w14:anchorId="6833476E">
-          <v:rect id="_x0000_i1081" style="width:0;height:1.5pt" o:hralign="center" o:hrstd="t" o:hr="t" fillcolor="#a0a0a0" stroked="f"/>
+        <w:t>Modo debug/release</w:t>
+      </w:r>
+    </w:p>
+    <w:p>
+      <w:r>
+        <w:pict w14:anchorId="181CFBDE">
+          <v:rect id="_x0000_i1027" style="width:0;height:1.5pt" o:hralign="center" o:hrstd="t" o:hr="t" fillcolor="#a0a0a0" stroked="f"/>
         </w:pict>
       </w:r>
     </w:p>
@@ -681,8 +700,8 @@
     <w:p>
       <w:r>
         <w:lastRenderedPageBreak/>
-        <w:pict w14:anchorId="12482B25">
-          <v:rect id="_x0000_i1082" style="width:0;height:1.5pt" o:hralign="center" o:hrstd="t" o:hr="t" fillcolor="#a0a0a0" stroked="f"/>
+        <w:pict w14:anchorId="2AF72D45">
+          <v:rect id="_x0000_i1028" style="width:0;height:1.5pt" o:hralign="center" o:hrstd="t" o:hr="t" fillcolor="#a0a0a0" stroked="f"/>
         </w:pict>
       </w:r>
     </w:p>
@@ -698,17 +717,8 @@
           <w:b/>
           <w:bCs/>
         </w:rPr>
-        <w:t xml:space="preserve">Parte 3 â€” </w:t>
-      </w:r>
-      <w:proofErr w:type="spellStart"/>
-      <w:r>
-        <w:rPr>
-          <w:b/>
-          <w:bCs/>
-        </w:rPr>
-        <w:t>Includes</w:t>
-      </w:r>
-      <w:proofErr w:type="spellEnd"/>
+        <w:t>Parte 3 â€” Includes</w:t>
+      </w:r>
     </w:p>
     <w:p>
       <w:r>
@@ -739,8 +749,8 @@
     </w:p>
     <w:p>
       <w:r>
-        <w:pict w14:anchorId="75ABD84B">
-          <v:rect id="_x0000_i1083" style="width:0;height:1.5pt" o:hralign="center" o:hrstd="t" o:hr="t" fillcolor="#a0a0a0" stroked="f"/>
+        <w:pict w14:anchorId="67907DB1">
+          <v:rect id="_x0000_i1029" style="width:0;height:1.5pt" o:hralign="center" o:hrstd="t" o:hr="t" fillcolor="#a0a0a0" stroked="f"/>
         </w:pict>
       </w:r>
     </w:p>
@@ -756,17 +766,8 @@
           <w:b/>
           <w:bCs/>
         </w:rPr>
-        <w:t xml:space="preserve">Parte 4 â€” </w:t>
-      </w:r>
-      <w:proofErr w:type="spellStart"/>
-      <w:r>
-        <w:rPr>
-          <w:b/>
-          <w:bCs/>
-        </w:rPr>
-        <w:t>Concurrency</w:t>
-      </w:r>
-      <w:proofErr w:type="spellEnd"/>
+        <w:t>Parte 4 â€” Concurrency</w:t>
+      </w:r>
     </w:p>
     <w:p>
       <w:r>
@@ -797,8 +798,8 @@
     </w:p>
     <w:p>
       <w:r>
-        <w:pict w14:anchorId="5C95BBBE">
-          <v:rect id="_x0000_i1084" style="width:0;height:1.5pt" o:hralign="center" o:hrstd="t" o:hr="t" fillcolor="#a0a0a0" stroked="f"/>
+        <w:pict w14:anchorId="2D32D009">
+          <v:rect id="_x0000_i1030" style="width:0;height:1.5pt" o:hralign="center" o:hrstd="t" o:hr="t" fillcolor="#a0a0a0" stroked="f"/>
         </w:pict>
       </w:r>
     </w:p>
@@ -814,29 +815,12 @@
           <w:b/>
           <w:bCs/>
         </w:rPr>
-        <w:t xml:space="preserve">Parte 5 â€” Job </w:t>
-      </w:r>
-      <w:proofErr w:type="spellStart"/>
-      <w:r>
-        <w:rPr>
-          <w:b/>
-          <w:bCs/>
-        </w:rPr>
-        <w:t>summary</w:t>
-      </w:r>
-      <w:proofErr w:type="spellEnd"/>
-    </w:p>
-    <w:p>
-      <w:r>
-        <w:t xml:space="preserve">Generar un resumen </w:t>
-      </w:r>
-      <w:proofErr w:type="spellStart"/>
-      <w:r>
-        <w:t>markdown</w:t>
-      </w:r>
-      <w:proofErr w:type="spellEnd"/>
-      <w:r>
-        <w:t xml:space="preserve"> que incluya:</w:t>
+        <w:t>Parte 5 â€” Job summary</w:t>
+      </w:r>
+    </w:p>
+    <w:p>
+      <w:r>
+        <w:t>Generar un resumen markdown que incluya:</w:t>
       </w:r>
     </w:p>
     <w:p>
@@ -880,18 +864,13 @@
         </w:numPr>
       </w:pPr>
       <w:r>
-        <w:t xml:space="preserve">InformaciÃ³n de </w:t>
-      </w:r>
-      <w:proofErr w:type="spellStart"/>
-      <w:r>
-        <w:t>matrix</w:t>
-      </w:r>
-      <w:proofErr w:type="spellEnd"/>
-    </w:p>
-    <w:p>
-      <w:r>
-        <w:pict w14:anchorId="775043A8">
-          <v:rect id="_x0000_i1085" style="width:0;height:1.5pt" o:hralign="center" o:hrstd="t" o:hr="t" fillcolor="#a0a0a0" stroked="f"/>
+        <w:t>InformaciÃ³n de matrix</w:t>
+      </w:r>
+    </w:p>
+    <w:p>
+      <w:r>
+        <w:pict w14:anchorId="1163AFDB">
+          <v:rect id="_x0000_i1031" style="width:0;height:1.5pt" o:hralign="center" o:hrstd="t" o:hr="t" fillcolor="#a0a0a0" stroked="f"/>
         </w:pict>
       </w:r>
     </w:p>
@@ -918,15 +897,7 @@
         </w:numPr>
       </w:pPr>
       <w:r>
-        <w:t xml:space="preserve">No crear </w:t>
-      </w:r>
-      <w:proofErr w:type="spellStart"/>
-      <w:r>
-        <w:t>jobs</w:t>
-      </w:r>
-      <w:proofErr w:type="spellEnd"/>
-      <w:r>
-        <w:t xml:space="preserve"> manuales duplicados</w:t>
+        <w:t>No crear jobs manuales duplicados</w:t>
       </w:r>
     </w:p>
     <w:p>
@@ -937,13 +908,8 @@
         </w:numPr>
       </w:pPr>
       <w:r>
-        <w:t xml:space="preserve">Toda expansiÃ³n debe provenir de </w:t>
-      </w:r>
-      <w:proofErr w:type="spellStart"/>
-      <w:r>
-        <w:t>matrix</w:t>
-      </w:r>
-      <w:proofErr w:type="spellEnd"/>
+        <w:t>Toda expansiÃ³n debe provenir de matrix</w:t>
+      </w:r>
     </w:p>
     <w:p>
       <w:pPr>
@@ -958,8 +924,8 @@
     </w:p>
     <w:p>
       <w:r>
-        <w:pict w14:anchorId="5D4089DA">
-          <v:rect id="_x0000_i1086" style="width:0;height:1.5pt" o:hralign="center" o:hrstd="t" o:hr="t" fillcolor="#a0a0a0" stroked="f"/>
+        <w:pict w14:anchorId="385E1C15">
+          <v:rect id="_x0000_i1032" style="width:0;height:1.5pt" o:hralign="center" o:hrstd="t" o:hr="t" fillcolor="#a0a0a0" stroked="f"/>
         </w:pict>
       </w:r>
     </w:p>
@@ -986,15 +952,7 @@
         </w:numPr>
       </w:pPr>
       <w:r>
-        <w:t xml:space="preserve">Pipeline </w:t>
-      </w:r>
-      <w:proofErr w:type="spellStart"/>
-      <w:r>
-        <w:t>matrix</w:t>
-      </w:r>
-      <w:proofErr w:type="spellEnd"/>
-      <w:r>
-        <w:t xml:space="preserve"> funcional</w:t>
+        <w:t>Pipeline matrix funcional</w:t>
       </w:r>
     </w:p>
     <w:p>
@@ -1005,13 +963,8 @@
         </w:numPr>
       </w:pPr>
       <w:r>
-        <w:t xml:space="preserve">ExplicaciÃ³n del nÃºmero total de </w:t>
-      </w:r>
-      <w:proofErr w:type="spellStart"/>
-      <w:r>
-        <w:t>jobs</w:t>
-      </w:r>
-      <w:proofErr w:type="spellEnd"/>
+        <w:t>ExplicaciÃ³n del nÃºmero total de jobs</w:t>
+      </w:r>
     </w:p>
     <w:p>
       <w:pPr>
@@ -1021,21 +974,13 @@
         </w:numPr>
       </w:pPr>
       <w:r>
-        <w:t xml:space="preserve">Capturas del </w:t>
-      </w:r>
-      <w:proofErr w:type="spellStart"/>
-      <w:r>
-        <w:t>summary</w:t>
-      </w:r>
-      <w:proofErr w:type="spellEnd"/>
-      <w:r>
-        <w:t xml:space="preserve"> generado</w:t>
-      </w:r>
-    </w:p>
-    <w:p>
-      <w:r>
-        <w:pict w14:anchorId="0FF559EC">
-          <v:rect id="_x0000_i1087" style="width:0;height:1.5pt" o:hralign="center" o:hrstd="t" o:hr="t" fillcolor="#a0a0a0" stroked="f"/>
+        <w:t>Capturas del summary generado</w:t>
+      </w:r>
+    </w:p>
+    <w:p>
+      <w:r>
+        <w:pict w14:anchorId="0D681BF6">
+          <v:rect id="_x0000_i1033" style="width:0;height:1.5pt" o:hralign="center" o:hrstd="t" o:hr="t" fillcolor="#a0a0a0" stroked="f"/>
         </w:pict>
       </w:r>
     </w:p>
@@ -1062,13 +1007,8 @@
         </w:numPr>
       </w:pPr>
       <w:r>
-        <w:t xml:space="preserve">Variables </w:t>
-      </w:r>
-      <w:proofErr w:type="spellStart"/>
-      <w:r>
-        <w:t>matrix</w:t>
-      </w:r>
-      <w:proofErr w:type="spellEnd"/>
+        <w:t>Variables matrix</w:t>
+      </w:r>
     </w:p>
     <w:p>
       <w:pPr>
@@ -1077,19 +1017,9 @@
           <w:numId w:val="10"/>
         </w:numPr>
       </w:pPr>
-      <w:proofErr w:type="spellStart"/>
-      <w:r>
-        <w:t>include</w:t>
-      </w:r>
-      <w:proofErr w:type="spellEnd"/>
-      <w:r>
-        <w:t>/</w:t>
-      </w:r>
-      <w:proofErr w:type="spellStart"/>
-      <w:r>
-        <w:t>exclude</w:t>
-      </w:r>
-      <w:proofErr w:type="spellEnd"/>
+      <w:r>
+        <w:t>include/exclude</w:t>
+      </w:r>
     </w:p>
     <w:p>
       <w:pPr>
@@ -1110,13 +1040,8 @@
           <w:numId w:val="10"/>
         </w:numPr>
       </w:pPr>
-      <w:proofErr w:type="spellStart"/>
-      <w:r>
-        <w:t>Conditions</w:t>
-      </w:r>
-      <w:proofErr w:type="spellEnd"/>
-      <w:r>
-        <w:t xml:space="preserve"> complejas</w:t>
+      <w:r>
+        <w:t>Conditions complejas</w:t>
       </w:r>
     </w:p>
     <w:p>
@@ -1127,18 +1052,505 @@
         </w:numPr>
       </w:pPr>
       <w:r>
-        <w:t xml:space="preserve">Resumen </w:t>
-      </w:r>
-      <w:proofErr w:type="spellStart"/>
-      <w:r>
-        <w:t>markdown</w:t>
-      </w:r>
-      <w:proofErr w:type="spellEnd"/>
-      <w:r>
-        <w:t xml:space="preserve"> mal formateado</w:t>
+        <w:t>Resumen markdown mal formateado</w:t>
       </w:r>
     </w:p>
     <w:p/>
+    <w:p>
+      <w:pPr>
+        <w:spacing w:before="120" w:after="120" w:line="240" w:lineRule="auto"/>
+      </w:pPr>
+    </w:p>
+    <w:p>
+      <w:pPr>
+        <w:spacing w:before="120" w:after="120" w:line="240" w:lineRule="auto"/>
+      </w:pPr>
+      <w:r>
+        <w:rPr>
+          <w:rFonts w:ascii="Calibri" w:hAnsi="Calibri"/>
+          <w:b/>
+        </w:rPr>
+        <w:t>----------------------------------------</w:t>
+      </w:r>
+    </w:p>
+    <w:p>
+      <w:pPr>
+        <w:spacing w:before="120" w:after="120" w:line="240" w:lineRule="auto"/>
+      </w:pPr>
+      <w:r>
+        <w:rPr>
+          <w:rFonts w:ascii="Calibri" w:hAnsi="Calibri"/>
+          <w:b/>
+          <w:color w:val="1F4E78"/>
+        </w:rPr>
+        <w:t>RESOLUCION Y DOCUMENTACION DEL LABORATORIO</w:t>
+      </w:r>
+    </w:p>
+    <w:p>
+      <w:pPr>
+        <w:spacing w:before="120" w:after="120" w:line="240" w:lineRule="auto"/>
+      </w:pPr>
+    </w:p>
+    <w:p>
+      <w:pPr>
+        <w:spacing w:before="120" w:after="120" w:line="240" w:lineRule="auto"/>
+      </w:pPr>
+      <w:r>
+        <w:rPr>
+          <w:rFonts w:ascii="Calibri" w:hAnsi="Calibri"/>
+          <w:b/>
+          <w:color w:val="2E75B6"/>
+        </w:rPr>
+        <w:t>1. Diseno de la Matriz y Calculo del Numero de Jobs</w:t>
+      </w:r>
+    </w:p>
+    <w:p>
+      <w:pPr>
+        <w:spacing w:before="120" w:after="120" w:line="240" w:lineRule="auto"/>
+      </w:pPr>
+      <w:r>
+        <w:rPr>
+          <w:rFonts w:ascii="Calibri" w:hAnsi="Calibri"/>
+          <w:i/>
+        </w:rPr>
+        <w:t>La estrategia 'strategy/matrix' permite definir combinaciones dinamicas de ejecucion para validar multiples entornos. En este pipeline, configuramos los siguientes parametros:</w:t>
+      </w:r>
+    </w:p>
+    <w:p>
+      <w:pPr>
+        <w:spacing w:before="120" w:after="120" w:line="240" w:lineRule="auto"/>
+      </w:pPr>
+      <w:r>
+        <w:rPr>
+          <w:rFonts w:ascii="Calibri" w:hAnsi="Calibri"/>
+        </w:rPr>
+        <w:t>- Sistemas Operativos (os): ubuntu-latest, windows-latest (2 opciones)</w:t>
+      </w:r>
+    </w:p>
+    <w:p>
+      <w:pPr>
+        <w:spacing w:before="120" w:after="120" w:line="240" w:lineRule="auto"/>
+      </w:pPr>
+      <w:r>
+        <w:rPr>
+          <w:rFonts w:ascii="Calibri" w:hAnsi="Calibri"/>
+        </w:rPr>
+        <w:t>- Versiones de Node.js (node-version): 18, 20 (2 opciones)</w:t>
+      </w:r>
+    </w:p>
+    <w:p>
+      <w:pPr>
+        <w:spacing w:before="120" w:after="120" w:line="240" w:lineRule="auto"/>
+      </w:pPr>
+      <w:r>
+        <w:rPr>
+          <w:rFonts w:ascii="Calibri" w:hAnsi="Calibri"/>
+        </w:rPr>
+        <w:t>- Modos de Compilacion (mode): debug, release (2 opciones)</w:t>
+      </w:r>
+    </w:p>
+    <w:p>
+      <w:pPr>
+        <w:spacing w:before="120" w:after="120" w:line="240" w:lineRule="auto"/>
+      </w:pPr>
+      <w:r>
+        <w:rPr>
+          <w:rFonts w:ascii="Calibri" w:hAnsi="Calibri"/>
+          <w:b/>
+        </w:rPr>
+        <w:t>Calculo Inicial (Sin Exclusiones):</w:t>
+      </w:r>
+    </w:p>
+    <w:p>
+      <w:pPr>
+        <w:spacing w:before="120" w:after="120" w:line="240" w:lineRule="auto"/>
+      </w:pPr>
+      <w:r>
+        <w:rPr>
+          <w:rFonts w:ascii="Calibri" w:hAnsi="Calibri"/>
+        </w:rPr>
+        <w:t>La expansion cartesiana total generaria: 2 (OS) * 2 (Node) * 2 (Modo) = 8 combinaciones (8 jobs de ejecucion).</w:t>
+      </w:r>
+    </w:p>
+    <w:p>
+      <w:pPr>
+        <w:spacing w:before="120" w:after="120" w:line="240" w:lineRule="auto"/>
+      </w:pPr>
+      <w:r>
+        <w:rPr>
+          <w:rFonts w:ascii="Calibri" w:hAnsi="Calibri"/>
+          <w:b/>
+        </w:rPr>
+        <w:t>Estrategia de Exclusion Aplicada (Parte 2):</w:t>
+      </w:r>
+    </w:p>
+    <w:p>
+      <w:pPr>
+        <w:spacing w:before="120" w:after="120" w:line="240" w:lineRule="auto"/>
+      </w:pPr>
+      <w:r>
+        <w:rPr>
+          <w:rFonts w:ascii="Calibri" w:hAnsi="Calibri"/>
+        </w:rPr>
+        <w:t>Excluimos especificamente las configuraciones de Windows en modo debug (windows-latest + debug). Esto se debe a que los builds de depuracion (debug) son muy especificos del desarrollo primario y se validan en profundidad en el entorno Linux (Ubuntu). Excluir Windows debug nos ahorra hasta un 25% de minutos de ejecucion en runners virtuales de Windows (que son computacionalmente mas caros).</w:t>
+      </w:r>
+    </w:p>
+    <w:p>
+      <w:pPr>
+        <w:spacing w:before="120" w:after="120" w:line="240" w:lineRule="auto"/>
+      </w:pPr>
+      <w:r>
+        <w:rPr>
+          <w:rFonts w:ascii="Calibri" w:hAnsi="Calibri"/>
+        </w:rPr>
+        <w:t>Esta exclusion elimina las siguientes 2 combinaciones:</w:t>
+      </w:r>
+    </w:p>
+    <w:p>
+      <w:pPr>
+        <w:spacing w:before="120" w:after="120" w:line="240" w:lineRule="auto"/>
+      </w:pPr>
+      <w:r>
+        <w:rPr>
+          <w:rFonts w:ascii="Calibri" w:hAnsi="Calibri"/>
+          <w:i/>
+        </w:rPr>
+        <w:t>- windows-latest + Node 18 + debug</w:t>
+      </w:r>
+    </w:p>
+    <w:p>
+      <w:pPr>
+        <w:spacing w:before="120" w:after="120" w:line="240" w:lineRule="auto"/>
+      </w:pPr>
+      <w:r>
+        <w:rPr>
+          <w:rFonts w:ascii="Calibri" w:hAnsi="Calibri"/>
+          <w:i/>
+        </w:rPr>
+        <w:t>- windows-latest + Node 20 + debug</w:t>
+      </w:r>
+    </w:p>
+    <w:p>
+      <w:pPr>
+        <w:spacing w:before="120" w:after="120" w:line="240" w:lineRule="auto"/>
+      </w:pPr>
+      <w:r>
+        <w:rPr>
+          <w:rFonts w:ascii="Calibri" w:hAnsi="Calibri"/>
+          <w:b/>
+          <w:color w:val="C00000"/>
+        </w:rPr>
+        <w:t>Total de Jobs Reales en Ejecucion: 8 (iniciales) - 2 (excluidos) = 6 jobs.</w:t>
+      </w:r>
+    </w:p>
+    <w:p>
+      <w:pPr>
+        <w:spacing w:before="120" w:after="120" w:line="240" w:lineRule="auto"/>
+      </w:pPr>
+    </w:p>
+    <w:p>
+      <w:pPr>
+        <w:spacing w:before="120" w:after="120" w:line="240" w:lineRule="auto"/>
+      </w:pPr>
+      <w:r>
+        <w:rPr>
+          <w:rFonts w:ascii="Calibri" w:hAnsi="Calibri"/>
+          <w:b/>
+          <w:color w:val="2E75B6"/>
+        </w:rPr>
+        <w:t>2. Inclusiones (Includes) y Variables de Entorno de Produccion</w:t>
+      </w:r>
+    </w:p>
+    <w:p>
+      <w:pPr>
+        <w:spacing w:before="120" w:after="120" w:line="240" w:lineRule="auto"/>
+      </w:pPr>
+      <w:r>
+        <w:rPr>
+          <w:rFonts w:ascii="Calibri" w:hAnsi="Calibri"/>
+        </w:rPr>
+        <w:t>Para agregar configuraciones especiales sin expandir la matriz cartesiana de forma redundante, se utilizo la seccion 'include'. Se configuraron las siguientes optimizaciones:</w:t>
+      </w:r>
+    </w:p>
+    <w:p>
+      <w:pPr>
+        <w:spacing w:before="120" w:after="120" w:line="240" w:lineRule="auto"/>
+      </w:pPr>
+      <w:r>
+        <w:rPr>
+          <w:rFonts w:ascii="Calibri" w:hAnsi="Calibri"/>
+        </w:rPr>
+        <w:t>- Configuracion Especial de Produccion: Para el entorno de Ubuntu con Node 20 en modo release (nuestro objetivo oficial de produccion), inyectamos variables adicionales:</w:t>
+      </w:r>
+    </w:p>
+    <w:p>
+      <w:pPr>
+        <w:spacing w:before="120" w:after="120" w:line="240" w:lineRule="auto"/>
+      </w:pPr>
+      <w:r>
+        <w:rPr>
+          <w:rFonts w:ascii="Calibri" w:hAnsi="Calibri"/>
+        </w:rPr>
+        <w:t>- production: true (Booleano para activar optimizaciones)</w:t>
+      </w:r>
+    </w:p>
+    <w:p>
+      <w:pPr>
+        <w:spacing w:before="120" w:after="120" w:line="240" w:lineRule="auto"/>
+      </w:pPr>
+      <w:r>
+        <w:rPr>
+          <w:rFonts w:ascii="Calibri" w:hAnsi="Calibri"/>
+        </w:rPr>
+        <w:t>- deploy-target: production-cloud (Ruta del despliegue final)</w:t>
+      </w:r>
+    </w:p>
+    <w:p>
+      <w:pPr>
+        <w:spacing w:before="120" w:after="120" w:line="240" w:lineRule="auto"/>
+      </w:pPr>
+      <w:r>
+        <w:rPr>
+          <w:rFonts w:ascii="Calibri" w:hAnsi="Calibri"/>
+        </w:rPr>
+        <w:t>- extra-flags: --optimize-all --minify (Parametros para minificar y optimizar el build)</w:t>
+      </w:r>
+    </w:p>
+    <w:p>
+      <w:pPr>
+        <w:spacing w:before="120" w:after="120" w:line="240" w:lineRule="auto"/>
+      </w:pPr>
+      <w:r>
+        <w:rPr>
+          <w:rFonts w:ascii="Calibri" w:hAnsi="Calibri"/>
+        </w:rPr>
+        <w:t>- Optimizaciones Generales de Release: Para el resto de combinaciones en modo 'release' (Ubuntu Node 18 y Windows Node 20), definimos un valor de compilacion por defecto:</w:t>
+      </w:r>
+    </w:p>
+    <w:p>
+      <w:pPr>
+        <w:spacing w:before="120" w:after="120" w:line="240" w:lineRule="auto"/>
+      </w:pPr>
+      <w:r>
+        <w:rPr>
+          <w:rFonts w:ascii="Calibri" w:hAnsi="Calibri"/>
+        </w:rPr>
+        <w:lastRenderedPageBreak/>
+        <w:t>- extra-flags: --optimize</w:t>
+      </w:r>
+    </w:p>
+    <w:p>
+      <w:pPr>
+        <w:spacing w:before="120" w:after="120" w:line="240" w:lineRule="auto"/>
+      </w:pPr>
+    </w:p>
+    <w:p>
+      <w:pPr>
+        <w:spacing w:before="120" w:after="120" w:line="240" w:lineRule="auto"/>
+      </w:pPr>
+      <w:r>
+        <w:rPr>
+          <w:rFonts w:ascii="Calibri" w:hAnsi="Calibri"/>
+          <w:b/>
+          <w:color w:val="2E75B6"/>
+        </w:rPr>
+        <w:t>3. Concurrencia y Resiliencia (Fail-Fast)</w:t>
+      </w:r>
+    </w:p>
+    <w:p>
+      <w:pPr>
+        <w:spacing w:before="120" w:after="120" w:line="240" w:lineRule="auto"/>
+      </w:pPr>
+      <w:r>
+        <w:rPr>
+          <w:rFonts w:ascii="Calibri" w:hAnsi="Calibri"/>
+        </w:rPr>
+        <w:t>- Concurrencia: Agregamos un bloque 'concurrency' con 'cancel-in-progress: true' basado en la rama actual. Si realizas un push y el pipeline anterior en esa misma rama aun esta ejecutandose, GitHub Actions cancela inmediatamente el pipeline anterior. Esto evita la acumulacion de ejecuciones obsoletas y optimiza el uso de recursos.</w:t>
+      </w:r>
+    </w:p>
+    <w:p>
+      <w:pPr>
+        <w:spacing w:before="120" w:after="120" w:line="240" w:lineRule="auto"/>
+      </w:pPr>
+      <w:r>
+        <w:rPr>
+          <w:rFonts w:ascii="Calibri" w:hAnsi="Calibri"/>
+        </w:rPr>
+        <w:t>- Resiliencia con Fail-Fast: Se configuro 'fail-fast: false' bajo la estrategia. De forma predeterminada, si un job de la matriz falla, GitHub cancela todos los demas. Al desactivarlo, permitimos que si el build de Node 18 falla por compatibilidad, los de mas jobs (ej. Node 20 en Ubuntu o Windows) continuen hasta completarse. Asi, el equipo de ingenieria obtiene una radiografia completa de todo el ecosistema en cada ejecucion.</w:t>
+      </w:r>
+    </w:p>
+    <w:p>
+      <w:pPr>
+        <w:spacing w:before="120" w:after="120" w:line="240" w:lineRule="auto"/>
+      </w:pPr>
+    </w:p>
+    <w:p>
+      <w:pPr>
+        <w:spacing w:before="120" w:after="120" w:line="240" w:lineRule="auto"/>
+      </w:pPr>
+      <w:r>
+        <w:rPr>
+          <w:rFonts w:ascii="Calibri" w:hAnsi="Calibri"/>
+          <w:b/>
+          <w:color w:val="2E75B6"/>
+        </w:rPr>
+        <w:t>4. Job Summary Dinamico (Markdown)</w:t>
+      </w:r>
+    </w:p>
+    <w:p>
+      <w:pPr>
+        <w:spacing w:before="120" w:after="120" w:line="240" w:lineRule="auto"/>
+      </w:pPr>
+      <w:r>
+        <w:rPr>
+          <w:rFonts w:ascii="Calibri" w:hAnsi="Calibri"/>
+        </w:rPr>
+        <w:t>En lugar de resumenes de texto plano, implementamos un paso en bash que escribe un informe Markdown completo en la variable especial ''. El resumen incluye:</w:t>
+      </w:r>
+    </w:p>
+    <w:p>
+      <w:pPr>
+        <w:spacing w:before="120" w:after="120" w:line="240" w:lineRule="auto"/>
+      </w:pPr>
+      <w:r>
+        <w:rPr>
+          <w:rFonts w:ascii="Calibri" w:hAnsi="Calibri"/>
+        </w:rPr>
+        <w:t>- Tabla Informativa: Indica el OS ejecutor, version runtime de Node, modo del build, estado final (Success/Failed) y el tiempo estimado del runner (1m 15s para Ubuntu, 2m 30s para Windows).</w:t>
+      </w:r>
+    </w:p>
+    <w:p>
+      <w:pPr>
+        <w:spacing w:before="120" w:after="120" w:line="240" w:lineRule="auto"/>
+      </w:pPr>
+      <w:r>
+        <w:rPr>
+          <w:rFonts w:ascii="Calibri" w:hAnsi="Calibri"/>
+        </w:rPr>
+        <w:t>- Bloques de Advertencia Enriquecidos (GitHub Alerts): Si se detecta un build de produccion (Ubuntu, Node 20, release), se genera un cuadro dinamico de tipo 'IMPORTANT' con el destino del despliegue en la nube. Si es release normal, muestra una nota informativa ('NOTE'). Si es debug, muestra un consejo tecnico ('TIP').</w:t>
+      </w:r>
+    </w:p>
+    <w:p>
+      <w:pPr>
+        <w:spacing w:before="120" w:after="120" w:line="240" w:lineRule="auto"/>
+      </w:pPr>
+    </w:p>
+    <w:p>
+      <w:pPr>
+        <w:spacing w:before="120" w:after="120" w:line="240" w:lineRule="auto"/>
+      </w:pPr>
+      <w:r>
+        <w:rPr>
+          <w:rFonts w:ascii="Calibri" w:hAnsi="Calibri"/>
+          <w:b/>
+          <w:color w:val="2E75B6"/>
+        </w:rPr>
+        <w:t>5. Guia de Capturas de Pantalla Requeridas</w:t>
+      </w:r>
+    </w:p>
+    <w:p>
+      <w:pPr>
+        <w:spacing w:before="120" w:after="120" w:line="240" w:lineRule="auto"/>
+        <w:rPr>
+          <w:rFonts w:ascii="Calibri" w:hAnsi="Calibri"/>
+          <w:i/>
+        </w:rPr>
+      </w:pPr>
+      <w:r>
+        <w:rPr>
+          <w:rFonts w:ascii="Calibri" w:hAnsi="Calibri"/>
+          <w:i/>
+        </w:rPr>
+        <w:lastRenderedPageBreak/>
+        <w:drawing>
+          <wp:inline distT="0" distB="0" distL="0" distR="0" wp14:anchorId="28342453" wp14:editId="17929E2C">
+            <wp:extent cx="5400040" cy="5105400"/>
+            <wp:effectExtent l="0" t="0" r="0" b="0"/>
+            <wp:docPr id="1" name="Imagen 1"/>
+            <wp:cNvGraphicFramePr>
+              <a:graphicFrameLocks xmlns:a="http://schemas.openxmlformats.org/drawingml/2006/main" noChangeAspect="1"/>
+            </wp:cNvGraphicFramePr>
+            <a:graphic xmlns:a="http://schemas.openxmlformats.org/drawingml/2006/main">
+              <a:graphicData uri="http://schemas.openxmlformats.org/drawingml/2006/picture">
+                <pic:pic xmlns:pic="http://schemas.openxmlformats.org/drawingml/2006/picture">
+                  <pic:nvPicPr>
+                    <pic:cNvPr id="1" name=""/>
+                    <pic:cNvPicPr/>
+                  </pic:nvPicPr>
+                  <pic:blipFill>
+                    <a:blip r:embed="rId8"/>
+                    <a:stretch>
+                      <a:fillRect/>
+                    </a:stretch>
+                  </pic:blipFill>
+                  <pic:spPr>
+                    <a:xfrm>
+                      <a:off x="0" y="0"/>
+                      <a:ext cx="5400040" cy="5105400"/>
+                    </a:xfrm>
+                    <a:prstGeom prst="rect">
+                      <a:avLst/>
+                    </a:prstGeom>
+                  </pic:spPr>
+                </pic:pic>
+              </a:graphicData>
+            </a:graphic>
+          </wp:inline>
+        </w:drawing>
+      </w:r>
+    </w:p>
+    <w:p>
+      <w:pPr>
+        <w:spacing w:before="120" w:after="120" w:line="240" w:lineRule="auto"/>
+        <w:rPr>
+          <w:rFonts w:ascii="Calibri" w:hAnsi="Calibri"/>
+          <w:i/>
+        </w:rPr>
+      </w:pPr>
+    </w:p>
+    <w:p>
+      <w:pPr>
+        <w:spacing w:before="120" w:after="120" w:line="240" w:lineRule="auto"/>
+      </w:pPr>
+      <w:r>
+        <w:lastRenderedPageBreak/>
+        <w:drawing>
+          <wp:inline distT="0" distB="0" distL="0" distR="0" wp14:anchorId="6D4E1BBF" wp14:editId="688B62E6">
+            <wp:extent cx="5372850" cy="6182588"/>
+            <wp:effectExtent l="0" t="0" r="0" b="8890"/>
+            <wp:docPr id="2" name="Imagen 2"/>
+            <wp:cNvGraphicFramePr>
+              <a:graphicFrameLocks xmlns:a="http://schemas.openxmlformats.org/drawingml/2006/main" noChangeAspect="1"/>
+            </wp:cNvGraphicFramePr>
+            <a:graphic xmlns:a="http://schemas.openxmlformats.org/drawingml/2006/main">
+              <a:graphicData uri="http://schemas.openxmlformats.org/drawingml/2006/picture">
+                <pic:pic xmlns:pic="http://schemas.openxmlformats.org/drawingml/2006/picture">
+                  <pic:nvPicPr>
+                    <pic:cNvPr id="1" name=""/>
+                    <pic:cNvPicPr/>
+                  </pic:nvPicPr>
+                  <pic:blipFill>
+                    <a:blip r:embed="rId9"/>
+                    <a:stretch>
+                      <a:fillRect/>
+                    </a:stretch>
+                  </pic:blipFill>
+                  <pic:spPr>
+                    <a:xfrm>
+                      <a:off x="0" y="0"/>
+                      <a:ext cx="5372850" cy="6182588"/>
+                    </a:xfrm>
+                    <a:prstGeom prst="rect">
+                      <a:avLst/>
+                    </a:prstGeom>
+                  </pic:spPr>
+                </pic:pic>
+              </a:graphicData>
+            </a:graphic>
+          </wp:inline>
+        </w:drawing>
+      </w:r>
+    </w:p>
     <w:p>
       <w:pPr>
         <w:spacing w:before="120" w:after="120" w:line="240" w:lineRule="auto"/>
@@ -1174,7 +1586,7 @@
           <w:b/>
           <w:color w:val="1F4E78"/>
         </w:rPr>
-        <w:t>RESOLUCION Y DOCUMENTACION DEL LABORATORIO</w:t>
+        <w:t>RESOLUCIÓN Y DOCUMENTACIÓN DEL LABORATORIO</w:t>
       </w:r>
     </w:p>
     <w:p>
@@ -1200,7 +1612,7 @@
           <w:b/>
           <w:color w:val="2E75B6"/>
         </w:rPr>
-        <w:t>1. Diseno de la Matriz y Calculo del Numero de Jobs</w:t>
+        <w:t>1. Diseño de la Matriz y Cálculo del Número de Jobs</w:t>
       </w:r>
     </w:p>
     <w:p>
@@ -1212,7 +1624,7 @@
           <w:rFonts w:ascii="Calibri" w:hAnsi="Calibri"/>
           <w:i/>
         </w:rPr>
-        <w:t>La estrategia 'strategy/matrix' permite definir combinaciones dinamicas de ejecucion para validar multiples entornos. En este pipeline, configuramos los siguientes parametros:</w:t>
+        <w:t>La estrategia 'strategy/matrix' permite definir combinaciones dinámicas de ejecución para validar múltiples entornos. En este pipeline, configuramos los siguientes parámetros:</w:t>
       </w:r>
     </w:p>
     <w:p>
@@ -1248,7 +1660,7 @@
         <w:rPr>
           <w:rFonts w:ascii="Calibri" w:hAnsi="Calibri"/>
         </w:rPr>
-        <w:t>- Modos de Compilacion (mode): debug, release (2 opciones)</w:t>
+        <w:t>- Modos de Compilación (mode): debug, release (2 opciones)</w:t>
       </w:r>
     </w:p>
     <w:p>
@@ -1260,7 +1672,7 @@
           <w:rFonts w:ascii="Calibri" w:hAnsi="Calibri"/>
           <w:b/>
         </w:rPr>
-        <w:t>Calculo Inicial (Sin Exclusiones):</w:t>
+        <w:t>Cálculo Inicial (Sin Exclusiones):</w:t>
       </w:r>
     </w:p>
     <w:p>
@@ -1272,7 +1684,7 @@
         <w:rPr>
           <w:rFonts w:ascii="Calibri" w:hAnsi="Calibri"/>
         </w:rPr>
-        <w:t>La expansion cartesiana total generaria: 2 (OS) * 2 (Node) * 2 (Modo) = 8 combinaciones (8 jobs de ejecucion).</w:t>
+        <w:t>La expansión cartesiana total generaría: 2 (OS) * 2 (Node) * 2 (Modo) = 8 combinaciones (8 jobs de ejecución).</w:t>
       </w:r>
     </w:p>
     <w:p>
@@ -1284,7 +1696,7 @@
           <w:rFonts w:ascii="Calibri" w:hAnsi="Calibri"/>
           <w:b/>
         </w:rPr>
-        <w:t>Estrategia de Exclusion Aplicada (Parte 2):</w:t>
+        <w:t>Estrategia de Exclusión Aplicada (Parte 2):</w:t>
       </w:r>
     </w:p>
     <w:p>
@@ -1296,7 +1708,7 @@
         <w:rPr>
           <w:rFonts w:ascii="Calibri" w:hAnsi="Calibri"/>
         </w:rPr>
-        <w:t>Excluimos especificamente las configuraciones de Windows en modo debug (windows-latest + debug). Esto se debe a que los builds de depuracion (debug) son muy especificos del desarrollo primario y se validan en profundidad en el entorno Linux (Ubuntu). Excluir Windows debug nos ahorra hasta un 25% de minutos de ejecucion en runners virtuales de Windows (que son computacionalmente mas caros).</w:t>
+        <w:t>Excluimos específicamente las configuraciones de Windows en modo debug (windows-latest + debug). Esto se debe a que los builds de depuración (debug) son muy específicos del desarrollo primario y se validan en profundidad en el entorno Linux (Ubuntu). Excluir Windows debug nos ahorra hasta un 25% de minutos de ejecución en runners virtuales de Windows (que son computacionalmente más caros).</w:t>
       </w:r>
     </w:p>
     <w:p>
@@ -1308,7 +1720,7 @@
         <w:rPr>
           <w:rFonts w:ascii="Calibri" w:hAnsi="Calibri"/>
         </w:rPr>
-        <w:t>Esta exclusion elimina las siguientes 2 combinaciones:</w:t>
+        <w:t>Esta exclusión elimina las siguientes 2 combinaciones:</w:t>
       </w:r>
     </w:p>
     <w:p>
@@ -1345,7 +1757,7 @@
           <w:b/>
           <w:color w:val="C00000"/>
         </w:rPr>
-        <w:t>Total de Jobs Reales en Ejecucion: 8 (iniciales) - 2 (excluidos) = 6 jobs.</w:t>
+        <w:t>Total de Jobs Reales en Ejecución: 8 (iniciales) - 2 (excluidos) = 6 jobs.</w:t>
       </w:r>
     </w:p>
     <w:p>
@@ -1371,7 +1783,7 @@
           <w:b/>
           <w:color w:val="2E75B6"/>
         </w:rPr>
-        <w:t>2. Inclusiones (Includes) y Variables de Entorno de Produccion</w:t>
+        <w:t>2. Inclusiones (Includes) y Variables de Entorno de Producción</w:t>
       </w:r>
     </w:p>
     <w:p>
@@ -1383,7 +1795,7 @@
         <w:rPr>
           <w:rFonts w:ascii="Calibri" w:hAnsi="Calibri"/>
         </w:rPr>
-        <w:t>Para agregar configuraciones especiales sin expandir la matriz cartesiana de forma redundante, se utilizo la seccion 'include'. Se configuraron las siguientes optimizaciones:</w:t>
+        <w:t>Para agregar configuraciones especiales sin expandir la matriz cartesiana de forma redundante, se utilizó la sección 'include'. Se configuraron las siguientes optimizaciones:</w:t>
       </w:r>
     </w:p>
     <w:p>
@@ -1395,7 +1807,7 @@
         <w:rPr>
           <w:rFonts w:ascii="Calibri" w:hAnsi="Calibri"/>
         </w:rPr>
-        <w:t>- Configuracion Especial de Produccion: Para el entorno de Ubuntu con Node 20 en modo release (nuestro objetivo oficial de produccion), inyectamos variables adicionales:</w:t>
+        <w:t>- Configuración Especial de Producción: Para el entorno de Ubuntu con Node 20 en modo release (nuestro objetivo oficial de producción), inyectamos variables adicionales:</w:t>
       </w:r>
     </w:p>
     <w:p>
@@ -1431,7 +1843,7 @@
         <w:rPr>
           <w:rFonts w:ascii="Calibri" w:hAnsi="Calibri"/>
         </w:rPr>
-        <w:t>  - extra-flags: --optimize-all --minify (Parametros para minificar y optimizar el build)</w:t>
+        <w:t>  - extra-flags: --optimize-all --minify (Parámetros para minificar y optimizar el build)</w:t>
       </w:r>
     </w:p>
     <w:p>
@@ -1443,7 +1855,7 @@
         <w:rPr>
           <w:rFonts w:ascii="Calibri" w:hAnsi="Calibri"/>
         </w:rPr>
-        <w:t>- Optimizaciones Generales de Release: Para el resto de combinaciones en modo 'release' (Ubuntu Node 18 y Windows Node 20), definimos un valor de compilacion por defecto:</w:t>
+        <w:t>- Optimizaciones Generales de Release: Para el resto de combinaciones en modo 'release' (Ubuntu Node 18 y Windows Node 20), definimos un valor de compilación por defecto:</w:t>
       </w:r>
     </w:p>
     <w:p>
@@ -1493,7 +1905,7 @@
         <w:rPr>
           <w:rFonts w:ascii="Calibri" w:hAnsi="Calibri"/>
         </w:rPr>
-        <w:t>- Concurrencia: Agregamos un bloque 'concurrency' con 'cancel-in-progress: true' basado en la rama actual. Si realizas un push y el pipeline anterior en esa misma rama aun esta ejecutandose, GitHub Actions cancela inmediatamente el pipeline anterior. Esto evita la acumulacion de ejecuciones obsoletas y optimiza el uso de recursos.</w:t>
+        <w:t>- Concurrencia: Agregamos un bloque 'concurrency' con 'cancel-in-progress: true' basado en la rama actual. Si realizas un push y el pipeline anterior en esa misma rama aun está ejecutándose, GitHub Actions cancela inmediatamente el pipeline anterior. Esto evita la acumulación de ejecuciones obsoletas y optimiza el uso de recursos.</w:t>
       </w:r>
     </w:p>
     <w:p>
@@ -1505,7 +1917,7 @@
         <w:rPr>
           <w:rFonts w:ascii="Calibri" w:hAnsi="Calibri"/>
         </w:rPr>
-        <w:t>- Resiliencia con Fail-Fast: Se configuro 'fail-fast: false' bajo la estrategia. De forma predeterminada, si un job de la matriz falla, GitHub cancela todos los demas. Al desactivarlo, permitimos que si el build de Node 18 falla por compatibilidad, los de mas jobs (ej. Node 20 en Ubuntu o Windows) continuen hasta completarse. Asi, el equipo de ingenieria obtiene una radiografia completa de todo el ecosistema en cada ejecucion.</w:t>
+        <w:t>- Resiliencia con Fail-Fast: Se configuró 'fail-fast: false' bajo la estrategia. De forma predeterminada, si un job de la matriz falla, GitHub cancela todos los demás. Al desactivarlo, permitimos que si el build de Node 18 falla por compatibilidad, los demás jobs (ej. Node 20 en Ubuntu o Windows) continúen hasta completarse. Así, el equipo de ingeniería obtiene una radiografía completa de todo el ecosistema en cada ejecución.</w:t>
       </w:r>
     </w:p>
     <w:p>
@@ -1531,7 +1943,7 @@
           <w:b/>
           <w:color w:val="2E75B6"/>
         </w:rPr>
-        <w:t>4. Job Summary Dinamico (Markdown)</w:t>
+        <w:t>4. Job Summary Dinámico (Markdown)</w:t>
       </w:r>
     </w:p>
     <w:p>
@@ -1543,7 +1955,7 @@
         <w:rPr>
           <w:rFonts w:ascii="Calibri" w:hAnsi="Calibri"/>
         </w:rPr>
-        <w:t>En lugar de resumenes de texto plano, implementamos un paso en bash que escribe un informe Markdown completo en la variable especial ''. El resumen incluye:</w:t>
+        <w:t>En lugar de resúmenes de texto plano, implementamos un paso en bash que escribe un informe Markdown completo en la variable especial ''. El resumen incluye:</w:t>
       </w:r>
     </w:p>
     <w:p>
@@ -1555,7 +1967,7 @@
         <w:rPr>
           <w:rFonts w:ascii="Calibri" w:hAnsi="Calibri"/>
         </w:rPr>
-        <w:t>- Tabla Informativa: Indica el OS ejecutor, version runtime de Node, modo del build, estado final (Success/Failed) y el tiempo estimado del runner (1m 15s para Ubuntu, 2m 30s para Windows).</w:t>
+        <w:t>- Tabla Informativa: Indica el OS ejecutor, versión runtime de Node, modo del build, estado final (Success/Failed) y el tiempo estimado del runner (1m 15s para Ubuntu, 2m 30s para Windows).</w:t>
       </w:r>
     </w:p>
     <w:p>
@@ -1567,7 +1979,7 @@
         <w:rPr>
           <w:rFonts w:ascii="Calibri" w:hAnsi="Calibri"/>
         </w:rPr>
-        <w:t>- Bloques de Advertencia Enriquecidos (GitHub Alerts): Si se detecta un build de produccion (Ubuntu, Node 20, release), se genera un cuadro dinamico de tipo 'IMPORTANT' con el destino del despliegue en la nube. Si es release normal, muestra una nota informativa ('NOTE'). Si es debug, muestra un consejo tecnico ('TIP').</w:t>
+        <w:t>- Bloques de Advertencia Enriquecidos (GitHub Alerts): Si se detecta un build de producción (Ubuntu, Node 20, release), se genera un cuadro dinámico de tipo 'IMPORTANT' con el destino del despliegue en la nube. Si es release normal, muestra una nota informativa ('NOTE'). Si es debug, muestra un consejo técnico ('TIP').</w:t>
       </w:r>
     </w:p>
     <w:p>
@@ -1593,7 +2005,7 @@
           <w:b/>
           <w:color w:val="2E75B6"/>
         </w:rPr>
-        <w:t>5. Guia de Capturas de Pantalla Requeridas</w:t>
+        <w:t>5. Guía de Capturas de Pantalla Requeridas</w:t>
       </w:r>
     </w:p>
     <w:p>
@@ -1617,7 +2029,7 @@
           <w:rFonts w:ascii="Calibri" w:hAnsi="Calibri"/>
           <w:b/>
         </w:rPr>
-        <w:t>- Captura 1 - Ejecucion de la Matriz (6 Jobs):</w:t>
+        <w:t>- Captura 1 - Ejecución de la Matriz (6 Jobs):</w:t>
       </w:r>
     </w:p>
     <w:p>
@@ -1629,7 +2041,7 @@
         <w:rPr>
           <w:rFonts w:ascii="Calibri" w:hAnsi="Calibri"/>
         </w:rPr>
-        <w:t>  - Ubicacion: Ve a la pestaÃ±a 'Actions' de tu repositorio en GitHub y selecciona la ultima ejecucion del pipeline.</w:t>
+        <w:t>  - Ubicación: Ve a la pestaña 'Actions' de tu repositorio en GitHub y selecciona la última ejecución del pipeline.</w:t>
       </w:r>
     </w:p>
     <w:p>
@@ -1641,7 +2053,7 @@
         <w:rPr>
           <w:rFonts w:ascii="Calibri" w:hAnsi="Calibri"/>
         </w:rPr>
-        <w:t>  - Que capturar: Toma una captura de pantalla del flujo de trabajo donde se visualice claramente que se han creado exactamente 6 jobs paralelos con los nombres expandidos dinamicamente:</w:t>
+        <w:t>  - Qué capturar: Toma una captura de pantalla del flujo de trabajo donde se visualice claramente que se han creado exactamente 6 jobs paralelos con los nombres expandidos dinámicamente:</w:t>
       </w:r>
     </w:p>
     <w:p>
@@ -1737,7 +2149,7 @@
         <w:rPr>
           <w:rFonts w:ascii="Calibri" w:hAnsi="Calibri"/>
         </w:rPr>
-        <w:t>  - Ubicacion: Dentro de la misma ejecucion en la pestaÃ±a 'Actions', haz clic en el boton 'Summary' en la esquina superior izquierda.</w:t>
+        <w:t>  - Ubicación: Dentro de la misma ejecución en la pestaña 'Actions', haz clic en el botón 'Summary' en la esquina superior izquierda.</w:t>
       </w:r>
     </w:p>
     <w:p>
@@ -1749,7 +2161,7 @@
         <w:rPr>
           <w:rFonts w:ascii="Calibri" w:hAnsi="Calibri"/>
         </w:rPr>
-        <w:t>  - Que capturar: Desplazate hacia abajo hasta la seccion del Job Summary. Captura la hermosa tabla generada dinamicamente y el cuadro informativo (Alert) de color que cambia dinamicamente segun la version y modo ejecutado.</w:t>
+        <w:t>  - Qué capturar: Desplázate hacia abajo hasta la sección del Job Summary. Captura la hermosa tabla generada dinámicamente y el cuadro informativo (Alert) de color que cambia dinámicamente según la versión y modo ejecutado.</w:t>
       </w:r>
     </w:p>
     <w:p>
@@ -1786,7 +2198,7 @@
           <w:rFonts w:ascii="Calibri" w:hAnsi="Calibri"/>
           <w:i/>
         </w:rPr>
-        <w:t>Documentacion autogenerada por Antigravity AI Coding Assistant el 20/05/2026 10:12:58</w:t>
+        <w:t>Documentación autogenerada por Antigravity AI Coding Assistant el 20/05/2026 10:35:53</w:t>
       </w:r>
     </w:p>
     <w:sectPr>
@@ -3374,7 +3786,6 @@
 <file path=word\settings.xml><?xml version="1.0" encoding="utf-8"?>
 <w:settings xmlns:mc="http://schemas.openxmlformats.org/markup-compatibility/2006" xmlns:o="urn:schemas-microsoft-com:office:office" xmlns:r="http://schemas.openxmlformats.org/officeDocument/2006/relationships" xmlns:m="http://schemas.openxmlformats.org/officeDocument/2006/math" xmlns:v="urn:schemas-microsoft-com:vml" xmlns:w10="urn:schemas-microsoft-com:office:word" xmlns:w="http://schemas.openxmlformats.org/wordprocessingml/2006/main" xmlns:w14="http://schemas.microsoft.com/office/word/2010/wordml" xmlns:w15="http://schemas.microsoft.com/office/word/2012/wordml" xmlns:w16cex="http://schemas.microsoft.com/office/word/2018/wordml/cex" xmlns:w16cid="http://schemas.microsoft.com/office/word/2016/wordml/cid" xmlns:w16="http://schemas.microsoft.com/office/word/2018/wordml" xmlns:w16sdtdh="http://schemas.microsoft.com/office/word/2020/wordml/sdtdatahash" xmlns:w16se="http://schemas.microsoft.com/office/word/2015/wordml/symex" xmlns:sl="http://schemas.openxmlformats.org/schemaLibrary/2006/main" mc:Ignorable="w14 w15 w16se w16cid w16 w16cex w16sdtdh">
   <w:zoom w:percent="100"/>
-  <w:proofState w:spelling="clean" w:grammar="clean"/>
   <w:defaultTabStop w:val="708"/>
   <w:hyphenationZone w:val="425"/>
   <w:characterSpacingControl w:val="doNotCompress"/>
@@ -3389,11 +3800,14 @@
   <w:rsids>
     <w:rsidRoot w:val="0049010D"/>
     <w:rsid w:val="0049010D"/>
+    <w:rsid w:val="004B2C5C"/>
     <w:rsid w:val="004C2C61"/>
     <w:rsid w:val="00545EAA"/>
     <w:rsid w:val="00571303"/>
     <w:rsid w:val="008F5E7A"/>
+    <w:rsid w:val="009A797E"/>
     <w:rsid w:val="00A5291F"/>
+    <w:rsid w:val="00A86039"/>
     <w:rsid w:val="00EC35FD"/>
   </w:rsids>
   <m:mathPr>
@@ -3419,7 +3833,7 @@
   </w:shapeDefaults>
   <w:decimalSymbol w:val=","/>
   <w:listSeparator w:val=";"/>
-  <w14:docId w14:val="4445BA3B"/>
+  <w14:docId w14:val="445EFB1F"/>
   <w15:chartTrackingRefBased/>
   <w15:docId w15:val="{E079596F-D102-420C-8037-B94B627DAF2B}"/>
 </w:settings>
@@ -4026,6 +4440,7 @@
   <w:style w:type="character" w:default="1" w:styleId="Fuentedeprrafopredeter">
     <w:name w:val="Default Paragraph Font"/>
     <w:uiPriority w:val="1"/>
+    <w:semiHidden/>
     <w:unhideWhenUsed/>
   </w:style>
   <w:style w:type="table" w:default="1" w:styleId="Tablanormal">

</xml_diff>

<commit_message>
docs: remove student card header from docx
</commit_message>
<xml_diff>
--- a/Laboratorio 3 — Matrix build enterprise.docx
+++ b/Laboratorio 3 — Matrix build enterprise.docx
@@ -299,83 +299,6 @@
 <file path=word\document.xml><?xml version="1.0" encoding="utf-8"?>
 <w:document xmlns:wpc="http://schemas.microsoft.com/office/word/2010/wordprocessingCanvas" xmlns:cx="http://schemas.microsoft.com/office/drawing/2014/chartex" xmlns:cx1="http://schemas.microsoft.com/office/drawing/2015/9/8/chartex" xmlns:cx2="http://schemas.microsoft.com/office/drawing/2015/10/21/chartex" xmlns:cx3="http://schemas.microsoft.com/office/drawing/2016/5/9/chartex" xmlns:cx4="http://schemas.microsoft.com/office/drawing/2016/5/10/chartex" xmlns:cx5="http://schemas.microsoft.com/office/drawing/2016/5/11/chartex" xmlns:cx6="http://schemas.microsoft.com/office/drawing/2016/5/12/chartex" xmlns:cx7="http://schemas.microsoft.com/office/drawing/2016/5/13/chartex" xmlns:cx8="http://schemas.microsoft.com/office/drawing/2016/5/14/chartex" xmlns:mc="http://schemas.openxmlformats.org/markup-compatibility/2006" xmlns:aink="http://schemas.microsoft.com/office/drawing/2016/ink" xmlns:am3d="http://schemas.microsoft.com/office/drawing/2017/model3d" xmlns:o="urn:schemas-microsoft-com:office:office" xmlns:oel="http://schemas.microsoft.com/office/2019/extlst" xmlns:r="http://schemas.openxmlformats.org/officeDocument/2006/relationships" xmlns:m="http://schemas.openxmlformats.org/officeDocument/2006/math" xmlns:v="urn:schemas-microsoft-com:vml" xmlns:wp14="http://schemas.microsoft.com/office/word/2010/wordprocessingDrawing" xmlns:wp="http://schemas.openxmlformats.org/drawingml/2006/wordprocessingDrawing" xmlns:w10="urn:schemas-microsoft-com:office:word" xmlns:w="http://schemas.openxmlformats.org/wordprocessingml/2006/main" xmlns:w14="http://schemas.microsoft.com/office/word/2010/wordml" xmlns:w15="http://schemas.microsoft.com/office/word/2012/wordml" xmlns:w16cex="http://schemas.microsoft.com/office/word/2018/wordml/cex" xmlns:w16cid="http://schemas.microsoft.com/office/word/2016/wordml/cid" xmlns:w16="http://schemas.microsoft.com/office/word/2018/wordml" xmlns:w16sdtdh="http://schemas.microsoft.com/office/word/2020/wordml/sdtdatahash" xmlns:w16se="http://schemas.microsoft.com/office/word/2015/wordml/symex" xmlns:wpg="http://schemas.microsoft.com/office/word/2010/wordprocessingGroup" xmlns:wpi="http://schemas.microsoft.com/office/word/2010/wordprocessingInk" xmlns:wne="http://schemas.microsoft.com/office/word/2006/wordml" xmlns:wps="http://schemas.microsoft.com/office/word/2010/wordprocessingShape" mc:Ignorable="w14 w15 w16se w16cid w16 w16cex w16sdtdh wp14">
   <w:body>
-    <w:p>
-      <w:pPr>
-        <w:spacing w:before="120" w:after="120" w:line="240" w:lineRule="auto"/>
-      </w:pPr>
-      <w:r>
-        <w:rPr>
-          <w:rFonts w:ascii="Calibri" w:hAnsi="Calibri"/>
-          <w:b/>
-          <w:color w:val="1F4E78"/>
-        </w:rPr>
-        <w:t>----------------------------------------------------------------------</w:t>
-      </w:r>
-    </w:p>
-    <w:p>
-      <w:pPr>
-        <w:spacing w:before="120" w:after="120" w:line="240" w:lineRule="auto"/>
-      </w:pPr>
-      <w:r>
-        <w:rPr>
-          <w:rFonts w:ascii="Calibri" w:hAnsi="Calibri"/>
-          <w:b/>
-          <w:color w:val="1F4E78"/>
-        </w:rPr>
-        <w:t>ESTUDIANTE: Lucas Arranz del Río</w:t>
-      </w:r>
-    </w:p>
-    <w:p>
-      <w:pPr>
-        <w:spacing w:before="120" w:after="120" w:line="240" w:lineRule="auto"/>
-      </w:pPr>
-      <w:r>
-        <w:rPr>
-          <w:rFonts w:ascii="Calibri" w:hAnsi="Calibri"/>
-          <w:b/>
-          <w:color w:val="1F4E78"/>
-        </w:rPr>
-        <w:t>LABORATORIO: Laboratorio 3 - Matrix Build Enterprise</w:t>
-      </w:r>
-    </w:p>
-    <w:p>
-      <w:pPr>
-        <w:spacing w:before="120" w:after="120" w:line="240" w:lineRule="auto"/>
-      </w:pPr>
-      <w:r>
-        <w:rPr>
-          <w:rFonts w:ascii="Calibri" w:hAnsi="Calibri"/>
-          <w:b/>
-          <w:color w:val="1F4E78"/>
-        </w:rPr>
-        <w:t>FECHA: 20/05/2026</w:t>
-      </w:r>
-    </w:p>
-    <w:p>
-      <w:pPr>
-        <w:spacing w:before="120" w:after="120" w:line="240" w:lineRule="auto"/>
-      </w:pPr>
-      <w:r>
-        <w:rPr>
-          <w:rFonts w:ascii="Calibri" w:hAnsi="Calibri"/>
-          <w:b/>
-          <w:color w:val="1F4E78"/>
-        </w:rPr>
-        <w:t>----------------------------------------------------------------------</w:t>
-      </w:r>
-    </w:p>
-    <w:p>
-      <w:pPr>
-        <w:spacing w:before="120" w:after="120" w:line="240" w:lineRule="auto"/>
-      </w:pPr>
-      <w:r>
-        <w:rPr>
-          <w:rFonts w:ascii="Calibri" w:hAnsi="Calibri"/>
-        </w:rPr>
-        <w:t>
-        </w:t>
-      </w:r>
-    </w:p>
     <w:p>
       <w:pPr>
         <w:rPr>

</xml_diff>